<commit_message>
module-6/LongModule-6.docx, module-6/~-6.docx, module-6/~WRL3772.tmp, module-7/LongModule7.2.docx, module-7/movies_queries.py
</commit_message>
<xml_diff>
--- a/module-6/LongModule-6.docx
+++ b/module-6/LongModule-6.docx
@@ -273,6 +273,17 @@
         </w:drawing>
       </w:r>
     </w:p>
+    <w:p>
+      <w:hyperlink r:id="rId8" w:history="1">
+        <w:r>
+          <w:rPr>
+            <w:rStyle w:val="Hyperlink"/>
+          </w:rPr>
+          <w:t>https://github.com/KitsuneGakusei/CSD-310</w:t>
+        </w:r>
+      </w:hyperlink>
+    </w:p>
+    <w:p/>
     <w:sectPr>
       <w:pgSz w:w="12240" w:h="15840"/>
       <w:pgMar w:top="720" w:right="720" w:bottom="720" w:left="720" w:header="720" w:footer="720" w:gutter="0"/>
@@ -1200,6 +1211,29 @@
       <w:spacing w:val="5"/>
     </w:rPr>
   </w:style>
+  <w:style w:type="character" w:styleId="Hyperlink">
+    <w:name w:val="Hyperlink"/>
+    <w:basedOn w:val="DefaultParagraphFont"/>
+    <w:uiPriority w:val="99"/>
+    <w:unhideWhenUsed/>
+    <w:rsid w:val="008E132E"/>
+    <w:rPr>
+      <w:color w:val="467886" w:themeColor="hyperlink"/>
+      <w:u w:val="single"/>
+    </w:rPr>
+  </w:style>
+  <w:style w:type="character" w:styleId="UnresolvedMention">
+    <w:name w:val="Unresolved Mention"/>
+    <w:basedOn w:val="DefaultParagraphFont"/>
+    <w:uiPriority w:val="99"/>
+    <w:semiHidden/>
+    <w:unhideWhenUsed/>
+    <w:rsid w:val="008E132E"/>
+    <w:rPr>
+      <w:color w:val="605E5C"/>
+      <w:shd w:val="clear" w:color="auto" w:fill="E1DFDD"/>
+    </w:rPr>
+  </w:style>
 </w:styles>
 </file>
 

</xml_diff>